<commit_message>
Add M2 baseline review: resolve FR-011/NFR-002 overlap, tighten FR-002 transitions, flag NFR-005/NFR-006 as pending
</commit_message>
<xml_diff>
--- a/docs/declarations/docs-stakeholder-analysis-AI DECLARATION.docx
+++ b/docs/declarations/docs-stakeholder-analysis-AI DECLARATION.docx
@@ -2130,196 +2130,6 @@
 </a:theme>
 </file>
 
-<file path=_xmlsignatures/sig1.xml><?xml version="1.0" encoding="utf-8"?>
-<Signature xmlns="http://www.w3.org/2000/09/xmldsig#" Id="idPackageSignature">
-  <SignedInfo>
-    <CanonicalizationMethod Algorithm="http://www.w3.org/TR/2001/REC-xml-c14n-20010315"/>
-    <SignatureMethod Algorithm="http://www.w3.org/2001/04/xmldsig-more#rsa-sha256"/>
-    <Reference Type="http://www.w3.org/2000/09/xmldsig#Object" URI="#idPackageObject">
-      <DigestMethod Algorithm="http://www.w3.org/2001/04/xmlenc#sha256"/>
-      <DigestValue>7GYbVquiy8pE5I3hYTk02j5MSFLdZieh0QKHmAtYR7Q=</DigestValue>
-    </Reference>
-    <Reference Type="http://www.w3.org/2000/09/xmldsig#Object" URI="#idOfficeObject">
-      <DigestMethod Algorithm="http://www.w3.org/2001/04/xmlenc#sha256"/>
-      <DigestValue>ZOnAh0pbfQFRtCYTf3WW1kt1nURAnlS8G1RIXcQMfY8=</DigestValue>
-    </Reference>
-    <Reference Type="http://uri.etsi.org/01903#SignedProperties" URI="#idSignedProperties">
-      <Transforms>
-        <Transform Algorithm="http://www.w3.org/TR/2001/REC-xml-c14n-20010315"/>
-      </Transforms>
-      <DigestMethod Algorithm="http://www.w3.org/2001/04/xmlenc#sha256"/>
-      <DigestValue>FAr9ZFlHIRetrpOn2pIGIUQx3YO4pl1v3X90vpm3SlM=</DigestValue>
-    </Reference>
-    <Reference Type="http://www.w3.org/2000/09/xmldsig#Object" URI="#idValidSigLnImg">
-      <DigestMethod Algorithm="http://www.w3.org/2001/04/xmlenc#sha256"/>
-      <DigestValue>1GX+oAQYf/hy2IVgOAdCfQndfJpF6nlQWrcPi8QiN0g=</DigestValue>
-    </Reference>
-    <Reference Type="http://www.w3.org/2000/09/xmldsig#Object" URI="#idInvalidSigLnImg">
-      <DigestMethod Algorithm="http://www.w3.org/2001/04/xmlenc#sha256"/>
-      <DigestValue>9JLRdUlpTEoI9j69fHu9yUes9IzkrSd9bmopILDBnA0=</DigestValue>
-    </Reference>
-  </SignedInfo>
-  <SignatureValue>CBK9S2gFphiD8vqw0D0XIW5zuDv0P5ibuxBnN5sD/2FICkLZWKkZdtVZnms4xlVUa099euUDHTIn
-2U4V00ufohebdmqccnpwWBOATQfTielZwfVIwanhI4oALP7BFSrbGfWU9mGhkw2WhIpa3I1z9jsB
-o7d0SrijtEbUYE25pLRMYSBhn1VE6UgWIF5x/THaleorecprna9erXIg2mbAzBckmH1yUC0P0Y6s
-r7S6uxl2U4vn/ht4VtXWX3QYuj16XxS/nbVj6+D9XgwLCeDt8cUSW421CIX6ZaEp5XVdTQiaqECK
-YSvzoRFxKtVH4hywCYq+kHR+2P78QmKG1mvWag==</SignatureValue>
-  <KeyInfo>
-    <X509Data>
-      <X509Certificate>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</X509Certificate>
-    </X509Data>
-  </KeyInfo>
-  <Object Id="idPackageObject">
-    <Manifest>
-      <Reference URI="/_rels/.rels?ContentType=application/vnd.openxmlformats-package.relationships+xml">
-        <Transforms>
-          <Transform Algorithm="http://schemas.openxmlformats.org/package/2006/RelationshipTransform">
-            <mdssi:RelationshipReference xmlns:mdssi="http://schemas.openxmlformats.org/package/2006/digital-signature" SourceId="rId1"/>
-          </Transform>
-          <Transform Algorithm="http://www.w3.org/TR/2001/REC-xml-c14n-20010315"/>
-        </Transforms>
-        <DigestMethod Algorithm="http://www.w3.org/2001/04/xmlenc#sha256"/>
-        <DigestValue>Mq3mDDWudLiaQFa1psBgLG+/en7p7r8re0MtlxnuiUI=</DigestValue>
-      </Reference>
-      <Reference URI="/word/_rels/document.xml.rels?ContentType=application/vnd.openxmlformats-package.relationships+xml">
-        <Transforms>
-          <Transform Algorithm="http://schemas.openxmlformats.org/package/2006/RelationshipTransform">
-            <mdssi:RelationshipReference xmlns:mdssi="http://schemas.openxmlformats.org/package/2006/digital-signature" SourceId="rId6"/>
-            <mdssi:RelationshipReference xmlns:mdssi="http://schemas.openxmlformats.org/package/2006/digital-signature" SourceId="rId11"/>
-            <mdssi:RelationshipReference xmlns:mdssi="http://schemas.openxmlformats.org/package/2006/digital-signature" SourceId="rId5"/>
-            <mdssi:RelationshipReference xmlns:mdssi="http://schemas.openxmlformats.org/package/2006/digital-signature" SourceId="rId10"/>
-            <mdssi:RelationshipReference xmlns:mdssi="http://schemas.openxmlformats.org/package/2006/digital-signature" SourceId="rId9"/>
-            <mdssi:RelationshipReference xmlns:mdssi="http://schemas.openxmlformats.org/package/2006/digital-signature" SourceId="rId8"/>
-            <mdssi:RelationshipReference xmlns:mdssi="http://schemas.openxmlformats.org/package/2006/digital-signature" SourceId="rId7"/>
-          </Transform>
-          <Transform Algorithm="http://www.w3.org/TR/2001/REC-xml-c14n-20010315"/>
-        </Transforms>
-        <DigestMethod Algorithm="http://www.w3.org/2001/04/xmlenc#sha256"/>
-        <DigestValue>zPkyiK9AZ+ZaU0SB76yvLdgnRWYEExzoB5z4+xaNbGw=</DigestValue>
-      </Reference>
-      <Reference URI="/word/document.xml?ContentType=application/vnd.openxmlformats-officedocument.wordprocessingml.document.main+xml">
-        <DigestMethod Algorithm="http://www.w3.org/2001/04/xmlenc#sha256"/>
-        <DigestValue>HgcXH2c6N+5aHEsfX0Ww5zdwhgq2cayr94gQKjkgmtE=</DigestValue>
-      </Reference>
-      <Reference URI="/word/fontTable.xml?ContentType=application/vnd.openxmlformats-officedocument.wordprocessingml.fontTable+xml">
-        <DigestMethod Algorithm="http://www.w3.org/2001/04/xmlenc#sha256"/>
-        <DigestValue>noVyktsWEvLHmGEDi8/e0w078P5zaEOTeF2/qic1Yec=</DigestValue>
-      </Reference>
-      <Reference URI="/word/glossary/_rels/document.xml.rels?ContentType=application/vnd.openxmlformats-package.relationships+xml">
-        <Transforms>
-          <Transform Algorithm="http://schemas.openxmlformats.org/package/2006/RelationshipTransform">
-            <mdssi:RelationshipReference xmlns:mdssi="http://schemas.openxmlformats.org/package/2006/digital-signature" SourceId="rId2"/>
-            <mdssi:RelationshipReference xmlns:mdssi="http://schemas.openxmlformats.org/package/2006/digital-signature" SourceId="rId1"/>
-            <mdssi:RelationshipReference xmlns:mdssi="http://schemas.openxmlformats.org/package/2006/digital-signature" SourceId="rId4"/>
-            <mdssi:RelationshipReference xmlns:mdssi="http://schemas.openxmlformats.org/package/2006/digital-signature" SourceId="rId3"/>
-          </Transform>
-          <Transform Algorithm="http://www.w3.org/TR/2001/REC-xml-c14n-20010315"/>
-        </Transforms>
-        <DigestMethod Algorithm="http://www.w3.org/2001/04/xmlenc#sha256"/>
-        <DigestValue>tI9MMc4dgyFVN51ZYv0+ie+qLoS977tYmLOtS8YjJ5U=</DigestValue>
-      </Reference>
-      <Reference URI="/word/glossary/document.xml?ContentType=application/vnd.openxmlformats-officedocument.wordprocessingml.document.glossary+xml">
-        <DigestMethod Algorithm="http://www.w3.org/2001/04/xmlenc#sha256"/>
-        <DigestValue>k+F1NScgT/0rzEkEA5Qi0zGnqvjVksqrvBZRTvaEd7I=</DigestValue>
-      </Reference>
-      <Reference URI="/word/glossary/fontTable.xml?ContentType=application/vnd.openxmlformats-officedocument.wordprocessingml.fontTable+xml">
-        <DigestMethod Algorithm="http://www.w3.org/2001/04/xmlenc#sha256"/>
-        <DigestValue>noVyktsWEvLHmGEDi8/e0w078P5zaEOTeF2/qic1Yec=</DigestValue>
-      </Reference>
-      <Reference URI="/word/glossary/settings.xml?ContentType=application/vnd.openxmlformats-officedocument.wordprocessingml.settings+xml">
-        <DigestMethod Algorithm="http://www.w3.org/2001/04/xmlenc#sha256"/>
-        <DigestValue>XmhEVzRpf3sH4Je8jpoLY7nBIzqdz3WbK1Uu6gV6sZg=</DigestValue>
-      </Reference>
-      <Reference URI="/word/glossary/styles.xml?ContentType=application/vnd.openxmlformats-officedocument.wordprocessingml.styles+xml">
-        <DigestMethod Algorithm="http://www.w3.org/2001/04/xmlenc#sha256"/>
-        <DigestValue>JTfohXkLXQYmCJbgBmTZTI5hH7XESfdk5v7HOyWU7/M=</DigestValue>
-      </Reference>
-      <Reference URI="/word/glossary/webSettings.xml?ContentType=application/vnd.openxmlformats-officedocument.wordprocessingml.webSettings+xml">
-        <DigestMethod Algorithm="http://www.w3.org/2001/04/xmlenc#sha256"/>
-        <DigestValue>8vb+dnljSWO/SbrmX5QfQZNN5Czus6gGr6xLq5InSFM=</DigestValue>
-      </Reference>
-      <Reference URI="/word/media/image1.emf?ContentType=image/x-emf">
-        <DigestMethod Algorithm="http://www.w3.org/2001/04/xmlenc#sha256"/>
-        <DigestValue>Ivuk+CthW4HxbdfueRVQtjl1WbGJN9bTNtWqADmoGFE=</DigestValue>
-      </Reference>
-      <Reference URI="/word/settings.xml?ContentType=application/vnd.openxmlformats-officedocument.wordprocessingml.settings+xml">
-        <DigestMethod Algorithm="http://www.w3.org/2001/04/xmlenc#sha256"/>
-        <DigestValue>HG/o+ZeRMkTqnL25x6syD+CI1lu7MLkovI2WvdgGKnU=</DigestValue>
-      </Reference>
-      <Reference URI="/word/styles.xml?ContentType=application/vnd.openxmlformats-officedocument.wordprocessingml.styles+xml">
-        <DigestMethod Algorithm="http://www.w3.org/2001/04/xmlenc#sha256"/>
-        <DigestValue>V4xLoDg6KFAqzK4iN1X4E91pZ+jEWfGPpDlzCkrM2iE=</DigestValue>
-      </Reference>
-      <Reference URI="/word/theme/theme1.xml?ContentType=application/vnd.openxmlformats-officedocument.theme+xml">
-        <DigestMethod Algorithm="http://www.w3.org/2001/04/xmlenc#sha256"/>
-        <DigestValue>UoNV+hWN7+aGBxoVh5c8Qc26MFclbfE7LycPDY8Ylvw=</DigestValue>
-      </Reference>
-      <Reference URI="/word/webSettings.xml?ContentType=application/vnd.openxmlformats-officedocument.wordprocessingml.webSettings+xml">
-        <DigestMethod Algorithm="http://www.w3.org/2001/04/xmlenc#sha256"/>
-        <DigestValue>8vb+dnljSWO/SbrmX5QfQZNN5Czus6gGr6xLq5InSFM=</DigestValue>
-      </Reference>
-    </Manifest>
-    <SignatureProperties>
-      <SignatureProperty Id="idSignatureTime" Target="#idPackageSignature">
-        <mdssi:SignatureTime xmlns:mdssi="http://schemas.openxmlformats.org/package/2006/digital-signature">
-          <mdssi:Format>YYYY-MM-DDThh:mm:ssTZD</mdssi:Format>
-          <mdssi:Value>2026-09-09T12:27:54Z</mdssi:Value>
-        </mdssi:SignatureTime>
-      </SignatureProperty>
-    </SignatureProperties>
-  </Object>
-  <Object Id="idOfficeObject">
-    <SignatureProperties>
-      <SignatureProperty Id="idOfficeV1Details" Target="#idPackageSignature">
-        <SignatureInfoV1 xmlns="http://schemas.microsoft.com/office/2006/digsig">
-          <SetupID>{2E52318D-CB36-4713-81DC-6D44E8BDD947}</SetupID>
-          <SignatureText>Karabo Masoka</SignatureText>
-          <SignatureImage/>
-          <SignatureComments/>
-          <WindowsVersion>10.0</WindowsVersion>
-          <OfficeVersion>16.0.20326/27</OfficeVersion>
-          <ApplicationVersion>16.0.20326</ApplicationVersion>
-          <Monitors>1</Monitors>
-          <HorizontalResolution>1920</HorizontalResolution>
-          <VerticalResolution>1080</VerticalResolution>
-          <ColorDepth>32</ColorDepth>
-          <SignatureProviderId>{00000000-0000-0000-0000-000000000000}</SignatureProviderId>
-          <SignatureProviderUrl/>
-          <SignatureProviderDetails>9</SignatureProviderDetails>
-          <SignatureType>2</SignatureType>
-        </SignatureInfoV1>
-      </SignatureProperty>
-    </SignatureProperties>
-  </Object>
-  <Object>
-    <xd:QualifyingProperties xmlns:xd="http://uri.etsi.org/01903/v1.3.2#" Target="#idPackageSignature">
-      <xd:SignedProperties Id="idSignedProperties">
-        <xd:SignedSignatureProperties>
-          <xd:SigningTime>2026-09-09T12:27:54Z</xd:SigningTime>
-          <xd:SigningCertificate>
-            <xd:Cert>
-              <xd:CertDigest>
-                <DigestMethod Algorithm="http://www.w3.org/2001/04/xmlenc#sha256"/>
-                <DigestValue>utJtnC4bvV2U5DHJJMpkBH0AZEsc2/SXQl6GyRa8IDM=</DigestValue>
-              </xd:CertDigest>
-              <xd:IssuerSerial>
-                <X509IssuerName>DC=net + DC=windows + CN=MS-Organization-Access + OU=82dbaca4-3e81-46ca-9c73-0950c1eaca97</X509IssuerName>
-                <X509SerialNumber>164923324377870356257932034625093631089</X509SerialNumber>
-              </xd:IssuerSerial>
-            </xd:Cert>
-          </xd:SigningCertificate>
-          <xd:SignaturePolicyIdentifier>
-            <xd:SignaturePolicyImplied/>
-          </xd:SignaturePolicyIdentifier>
-        </xd:SignedSignatureProperties>
-      </xd:SignedProperties>
-    </xd:QualifyingProperties>
-  </Object>
-  <Object Id="idValidSigLnImg">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</Object>
-  <Object Id="idInvalidSigLnImg">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</Object>
-</Signature>
-</file>
-
 <file path=customXml/item1.xml><?xml version="1.0" encoding="utf-8"?>
 <?mso-contentType ?>
 <FormTemplates xmlns="http://schemas.microsoft.com/sharepoint/v3/contenttype/forms">

</xml_diff>